<commit_message>
[FIX] Validacion CFA v1.2
</commit_message>
<xml_diff>
--- a/fuentes/CF4_240201524_DI.docx
+++ b/fuentes/CF4_240201524_DI.docx
@@ -2670,7 +2670,7 @@
           <w:b w:val="1"/>
           <w:bCs w:val="1"/>
         </w:rPr>
-        <w:t xml:space="preserve"> tema.</w:t>
+        <w:t xml:space="preserve"> tema</w:t>
       </w:r>
     </w:p>
     <w:p>
@@ -2771,6 +2771,10 @@
     <w:p>
       <w:pPr>
         <w:pStyle w:val="Prrafodelista"/>
+        <w:rPr>
+          <w:noProof w:val="0"/>
+          <w:lang w:val="es-CO"/>
+        </w:rPr>
       </w:pPr>
       <w:r>
         <w:rPr/>
@@ -2785,11 +2789,29 @@
         <w:t xml:space="preserve"> </w:t>
       </w:r>
       <w:r>
+        <w:rPr/>
+        <w:t xml:space="preserve">como refiere </w:t>
+      </w:r>
+      <w:r>
         <w:rPr>
           <w:noProof w:val="0"/>
           <w:lang w:val="es-CO"/>
         </w:rPr>
-        <w:t>Sánchez (2007) señala que "elabore argumentaciones que corroboren la tesis que se está escribiendo" (p. 453).</w:t>
+        <w:t>Sánchez (2007)</w:t>
+      </w:r>
+      <w:r>
+        <w:rPr>
+          <w:noProof w:val="0"/>
+          <w:lang w:val="es-CO"/>
+        </w:rPr>
+        <w:t xml:space="preserve">, </w:t>
+      </w:r>
+      <w:r>
+        <w:rPr>
+          <w:noProof w:val="0"/>
+          <w:lang w:val="es-CO"/>
+        </w:rPr>
+        <w:t>"elabore argumentaciones que corroboren la tesis que se está escribiendo" (p. 453).</w:t>
       </w:r>
     </w:p>
     <w:p>
@@ -2894,9 +2916,19 @@
           <w:ilvl w:val="0"/>
           <w:numId w:val="6"/>
         </w:numPr>
-      </w:pPr>
-      <w:r>
-        <w:t>Organiza el material consultado y citado por estudiantes, profesores e investigadores.</w:t>
+        <w:rPr/>
+      </w:pPr>
+      <w:r>
+        <w:rPr/>
+        <w:t>Organiza</w:t>
+      </w:r>
+      <w:r>
+        <w:rPr/>
+        <w:t>r</w:t>
+      </w:r>
+      <w:r>
+        <w:rPr/>
+        <w:t xml:space="preserve"> el material consultado y citado por estudiantes, profesores e investigadores.</w:t>
       </w:r>
     </w:p>
     <w:p/>
@@ -4341,25 +4373,176 @@
     <w:p>
       <w:pPr>
         <w:rPr>
-          <w:i/>
-          <w:iCs/>
-        </w:rPr>
-      </w:pPr>
-      <w:r>
-        <w:rPr>
-          <w:i/>
-          <w:iCs/>
-        </w:rPr>
-        <w:lastRenderedPageBreak/>
-        <w:t xml:space="preserve">KOSTOFF, RN. The use and misuse of citation analysis in research evaluation. En: Scientometrics. Budapest, </w:t>
-      </w:r>
-      <w:r>
+          <w:i w:val="1"/>
+          <w:iCs w:val="1"/>
+          <w:lang w:val="en-US"/>
+        </w:rPr>
+      </w:pPr>
+      <w:r>
+        <w:rPr>
+          <w:rFonts w:ascii="Arial" w:hAnsi="Arial" w:eastAsia="Arial" w:cs="Arial"/>
+          <w:noProof w:val="0"/>
+          <w:sz w:val="22"/>
+          <w:szCs w:val="22"/>
+          <w:lang w:val="en-US"/>
+        </w:rPr>
+        <w:t>¹</w:t>
+      </w:r>
+      <w:r>
+        <w:rPr>
+          <w:i w:val="1"/>
+          <w:iCs w:val="1"/>
+          <w:lang w:val="en-US"/>
+        </w:rPr>
+        <w:t xml:space="preserve"> </w:t>
+      </w:r>
+      <w:r>
+        <w:rPr>
+          <w:i w:val="1"/>
+          <w:iCs w:val="1"/>
+          <w:lang w:val="en-US"/>
+        </w:rPr>
+        <w:t xml:space="preserve">KOSTOFF, RN. </w:t>
+      </w:r>
+      <w:r>
+        <w:rPr>
+          <w:i w:val="1"/>
+          <w:iCs w:val="1"/>
+          <w:lang w:val="en-US"/>
+        </w:rPr>
+        <w:t>The</w:t>
+      </w:r>
+      <w:r>
+        <w:rPr>
+          <w:i w:val="1"/>
+          <w:iCs w:val="1"/>
+          <w:lang w:val="en-US"/>
+        </w:rPr>
+        <w:t xml:space="preserve"> use and </w:t>
+      </w:r>
+      <w:r>
+        <w:rPr>
+          <w:i w:val="1"/>
+          <w:iCs w:val="1"/>
+          <w:lang w:val="en-US"/>
+        </w:rPr>
+        <w:t>misuse</w:t>
+      </w:r>
+      <w:r>
+        <w:rPr>
+          <w:i w:val="1"/>
+          <w:iCs w:val="1"/>
+          <w:lang w:val="en-US"/>
+        </w:rPr>
+        <w:t xml:space="preserve"> </w:t>
+      </w:r>
+      <w:r>
+        <w:rPr>
+          <w:i w:val="1"/>
+          <w:iCs w:val="1"/>
+          <w:lang w:val="en-US"/>
+        </w:rPr>
+        <w:t>of</w:t>
+      </w:r>
+      <w:r>
+        <w:rPr>
+          <w:i w:val="1"/>
+          <w:iCs w:val="1"/>
+          <w:lang w:val="en-US"/>
+        </w:rPr>
+        <w:t xml:space="preserve"> </w:t>
+      </w:r>
+      <w:r>
+        <w:rPr>
+          <w:i w:val="1"/>
+          <w:iCs w:val="1"/>
+          <w:lang w:val="en-US"/>
+        </w:rPr>
+        <w:t>citation</w:t>
+      </w:r>
+      <w:r>
+        <w:rPr>
+          <w:i w:val="1"/>
+          <w:iCs w:val="1"/>
+          <w:lang w:val="en-US"/>
+        </w:rPr>
+        <w:t xml:space="preserve"> </w:t>
+      </w:r>
+      <w:r>
+        <w:rPr>
+          <w:i w:val="1"/>
+          <w:iCs w:val="1"/>
+          <w:lang w:val="en-US"/>
+        </w:rPr>
+        <w:t>analysis</w:t>
+      </w:r>
+      <w:r>
+        <w:rPr>
+          <w:i w:val="1"/>
+          <w:iCs w:val="1"/>
+          <w:lang w:val="en-US"/>
+        </w:rPr>
+        <w:t xml:space="preserve"> in </w:t>
+      </w:r>
+      <w:r>
+        <w:rPr>
+          <w:i w:val="1"/>
+          <w:iCs w:val="1"/>
+          <w:lang w:val="en-US"/>
+        </w:rPr>
+        <w:t>research</w:t>
+      </w:r>
+      <w:r>
+        <w:rPr>
+          <w:i w:val="1"/>
+          <w:iCs w:val="1"/>
+          <w:lang w:val="en-US"/>
+        </w:rPr>
+        <w:t xml:space="preserve"> </w:t>
+      </w:r>
+      <w:r>
+        <w:rPr>
+          <w:i w:val="1"/>
+          <w:iCs w:val="1"/>
+          <w:lang w:val="en-US"/>
+        </w:rPr>
+        <w:t>evaluation</w:t>
+      </w:r>
+      <w:r>
+        <w:rPr>
+          <w:i w:val="1"/>
+          <w:iCs w:val="1"/>
+          <w:lang w:val="en-US"/>
+        </w:rPr>
+        <w:t xml:space="preserve">. En: </w:t>
+      </w:r>
+      <w:r>
+        <w:rPr>
+          <w:i w:val="1"/>
+          <w:iCs w:val="1"/>
+          <w:lang w:val="en-US"/>
+        </w:rPr>
+        <w:t>Scientometrics</w:t>
+      </w:r>
+      <w:r>
+        <w:rPr>
+          <w:i w:val="1"/>
+          <w:iCs w:val="1"/>
+          <w:lang w:val="en-US"/>
+        </w:rPr>
+        <w:t xml:space="preserve">. Budapest, </w:t>
+      </w:r>
+      <w:r>
+        <w:rPr>
+          <w:lang w:val="en-US"/>
+        </w:rPr>
         <w:t>1998. Vol. 43, no.1. p.28</w:t>
       </w:r>
       <w:r>
         <w:rPr>
-          <w:i/>
-          <w:iCs/>
+          <w:i w:val="1"/>
+          <w:iCs w:val="1"/>
+          <w:lang w:val="en-US"/>
         </w:rPr>
         <w:t>”</w:t>
       </w:r>
@@ -6261,7 +6444,7 @@
                 <w:b w:val="0"/>
                 <w:bCs w:val="0"/>
               </w:rPr>
-              <w:t>Sánchez, Lobato</w:t>
+              <w:t>Sánchez Lobato</w:t>
             </w:r>
             <w:r>
               <w:rPr>
@@ -7919,7 +8102,7 @@
           <w:sz w:val="24"/>
           <w:szCs w:val="24"/>
         </w:rPr>
-        <w:t xml:space="preserve">Sánchez, </w:t>
+        <w:t xml:space="preserve">Sánchez </w:t>
       </w:r>
       <w:r>
         <w:rPr>
@@ -7975,7 +8158,7 @@
         </w:rPr>
         <w:t xml:space="preserve"> </w:t>
       </w:r>
-      <w:hyperlink r:id="R420b93521e864e9c">
+      <w:hyperlink r:id="Rde44713707264901">
         <w:r>
           <w:rPr>
             <w:rStyle w:val="Hipervnculo"/>

</xml_diff>